<commit_message>
docs: chiusura lavoro 26.10.2026 — documentazione, diario, CLAUDE.md, README, prossimi passi, prd.json della fase 8b
Co-Authored-By: Claude Opus 5.5 <noreply@anthropic.com>
Claude-Session: https://claude.ai/code/session_014ycMSkFAn8ixUvbSfrqtAR
</commit_message>
<xml_diff>
--- a/DIARIO_Mirwada.docx
+++ b/DIARIO_Mirwada.docx
@@ -187,6 +187,50 @@
       </w:r>
       <w:r>
         <w:t>Il verdetto e' netto: l'architettura regge. I sette sistemi di supporto compongono un ciclo di crafting completo senza una riga di codice che nomini un contenuto. Le uniche stringhe di dominio nel codice sono nomi di vocabolari chiusi - 'laboratorio', 'enemy_defeated', 'forza' - che i sistemi indirizzano per chiave, non come casi speciali. Il punto di controllo della fase 5, aggiungere i nove Pathway rimanenti coi dati e non col codice, non e' minacciato da niente di quello che ho scritto in queste due sessioni.</w:t>
+      </w:r>
+    </w:p>
+    <w:p>
+      <w:r>
+        <w:rPr>
+          <w:b/>
+          <w:i w:val="0"/>
+          <w:color w:val="1A237E"/>
+          <w:sz w:val="26"/>
+        </w:rPr>
+        <w:t>26.10.2026 (riepilogo dal 07.09 e chiusura del 23-26.10)</w:t>
+      </w:r>
+    </w:p>
+    <w:p>
+      <w:r>
+        <w:rPr>
+          <w:b/>
+        </w:rPr>
+        <w:t xml:space="preserve">1) Lavori effettuati: </w:t>
+      </w:r>
+      <w:r>
+        <w:t>Dal 7 settembre il lavoro si era diviso in due rami senza che me ne accorgessi: su uno (PR #4) sono state chiuse le fasi 8, 9, 10 e 11 (vertical slice giocabile, Pathway non-standard, mondo continuo a layout, villaggi ed economia); sull'altro (PR #5) l'arte con sprite-forge (personaggi a 64 px, terreni, pareti, il mondo generato col seed 6, le due modalita' luminosa e cupa). In questi giorni ho portato il mondo generato nel gioco: un caricatore che costruisce solo i blocchi attorno al giocatore, la regione e la zona dalla posizione, gli NPC al loro luogo con un aspetto proprio per ognuno, il gating d'ingresso e il viaggio veloce. Il controllo completo del progetto ha trovato il ramo parallelo: l'ho unito senza toccare il mondo generato (970 test). Poi ho sistemato tre test che si interrompevano a meta' contati come superati e ho messo una guardia (tools/run_tests.sh), riacceso la CI, corretto le collisioni, portato il sottosuolo nel gioco come secondo livello, ridisegnato il libro (cuoio, pergamena, Alegreya) e riportato nemici, boss e oggetti dei layout sul mondo generato. 982 test.</w:t>
+      </w:r>
+    </w:p>
+    <w:p>
+      <w:r>
+        <w:rPr>
+          <w:b/>
+        </w:rPr>
+        <w:t xml:space="preserve">2) Problemi riscontrati: </w:t>
+      </w:r>
+      <w:r>
+        <w:t>Le Marche non si raggiungevano a piedi per errore: nel calcolo delle collisioni il vicino 'a nord' era quello a sud (la fila in cima a ogni scala era un muro) e le strade non attraversavano nessun dislivello. L'utente ha deciso che alle Marche si arriva solo volando o dal sottosuolo: ora e' cosi' per scelta, verificato da un test di raggiungibilita' guidato dai dati. Nel popolamento un boss finiva a 20 caselle dalla partenza (la zona 'sotterraneo' del layout non aveva un luogo in superficie: ora va nelle fogne) e un nemico a 4: un raggio senza nemici attorno alla partenza nei dati. Il formato delle zone dei layout e' [x, y, larghezza, altezza], non due angoli: l'ho capito da una prova che non tornava.</w:t>
+      </w:r>
+    </w:p>
+    <w:p>
+      <w:r>
+        <w:rPr>
+          <w:b/>
+        </w:rPr>
+        <w:t xml:space="preserve">3) Eventuali osservazioni: </w:t>
+      </w:r>
+      <w:r>
+        <w:t>Il generatore aveva gia' fatto molto lavoro che non usavamo: una sola rete sotterranea che collega tutto il continente, i sedimi degli edifici della citta' per quartiere, i villaggi suggeriti. Restano da fare gli edifici (la citta' e' ancora di sola pietra), la decisione sul volo e l'accesso alla Frontiera.</w:t>
       </w:r>
     </w:p>
     <w:sectPr>

</xml_diff>

<commit_message>
docs: chiusura lavoro 29.10.2026 — fase 8b chiusa, documentazione, diario, README, CLAUDE.md
Documentazione e diario aggiornati al 29.10 (dal 26.10: interni, varchi,
mezzi, icone, VFX, ritratti, libro, forme e gesti di Enel, forzieri, fauna,
cannocchiale, notte, base del giocatore; controllo del 29.10). CLAUDE.md:
fase 8b chiusa, fasi 12-14 rinumerate, niente controlli automatici della PR.

Co-Authored-By: Claude Opus 5.5 <noreply@anthropic.com>
Claude-Session: https://claude.ai/code/session_014ycMSkFAn8ixUvbSfrqtAR
</commit_message>
<xml_diff>
--- a/DIARIO_Mirwada.docx
+++ b/DIARIO_Mirwada.docx
@@ -231,6 +231,50 @@
       </w:r>
       <w:r>
         <w:t>Il generatore aveva gia' fatto molto lavoro che non usavamo: una sola rete sotterranea che collega tutto il continente, i sedimi degli edifici della citta' per quartiere, i villaggi suggeriti. Restano da fare gli edifici (la citta' e' ancora di sola pietra), la decisione sul volo e l'accesso alla Frontiera.</w:t>
+      </w:r>
+    </w:p>
+    <w:p>
+      <w:r>
+        <w:rPr>
+          <w:b/>
+          <w:i w:val="0"/>
+          <w:color w:val="1A237E"/>
+          <w:sz w:val="26"/>
+        </w:rPr>
+        <w:t>29.10.2026 (dal 26.10 pomeriggio: fase 8b chiusa, controllo e tutto su main)</w:t>
+      </w:r>
+    </w:p>
+    <w:p>
+      <w:r>
+        <w:rPr>
+          <w:b/>
+        </w:rPr>
+        <w:t xml:space="preserve">1) Lavori effettuati: </w:t>
+      </w:r>
+      <w:r>
+        <w:t>In questi giorni ho chiuso tutta l'arte della fase 8b. Le case di Mirwada e dei villaggi hanno le porte verso interni disegnati e arredati; i varchi delle sotto-aree sono ingressi con il loro contenuto; ci sono la barca, il volo con la piuma dei venti e la soglia del faro verso la Frontiera. Poi le icone (oggetti, stati, primitive), i VFX di tutte le primitive e il feedback del colpo, i ritratti nel dialogo, il libro sulle due facciate, le due forme di Enel e i suoi gesti, Enel in volo e in barca, il panorama dell'avvio. Infine forzieri e oggetti nelle case, la fauna che scappa, il cannocchiale del faro con la lente, il buio di notte, e la base del giocatore nelle quattro versioni con le stanze, la sede che si sposta, l'orto all'aperto, le strutture e la nave. Il 29 ho fatto il controllo completo, corretto tre cose (oggetti che ricomparivano, HUD poco leggibile, strutture attraversabili) e segnato in prd.json tutto quello che manca: 57 story.</w:t>
+      </w:r>
+    </w:p>
+    <w:p>
+      <w:r>
+        <w:rPr>
+          <w:b/>
+        </w:rPr>
+        <w:t xml:space="preserve">2) Problemi riscontrati: </w:t>
+      </w:r>
+      <w:r>
+        <w:t>Molti errori li hanno trovati solo le schermate: un orto sotto la chioma di un albero, una passerella della nave su un pontile chiuso da un dislivello, le stanze della base sotto l'HUD perche' la camera seguiva Enel. Un errore mio: avevo chiamato 'chiave' il segno sugli oggetti presi, ma e' lo stesso nome che il mondo usa per le soglie chiuse a chiave, e il mondo li prendeva per porte; la suite con la guardia sugli errori di script l'ha fermato subito. Nella Valle le capanne del villaggio erano gia' tutte occupate dagli interni dell'avamposto: il generatore mette una casa per ogni interno, e rigenerando gli edifici e' comparsa la capanna della base senza toccare il resto.</w:t>
+      </w:r>
+    </w:p>
+    <w:p>
+      <w:r>
+        <w:rPr>
+          <w:b/>
+        </w:rPr>
+        <w:t xml:space="preserve">3) Eventuali osservazioni: </w:t>
+      </w:r>
+      <w:r>
+        <w:t>Il gioco adesso si vede finito ma non si puo' ancora finire: la storia dell'Atto II e III manca, e la prova finale non ha nessuna fonte che la segni superata. Viene prima di tutto il resto. Il PRD del Mondo vivo era scritto per la mappa a layout e va rifatto sul mondo generato, che ha gia' 34 villaggi. Su richiesta dell'utente niente piu' controlli automatici della PR: si controlla solo quando lo chiede l'utente, e il lavoro e' tutto su main.</w:t>
       </w:r>
     </w:p>
     <w:sectPr>

</xml_diff>